<commit_message>
privacy: reframe dependents as generic (person/pet/anyone) across the corpus
Match the app change (PR #3219): dependents is a generic 'someone you care for'
list, not a minors registry. Dossier ROPA row 5 + SPI age/minors row, binding
policy §A.5 flag + amendment, counsel packet Item 1, reconciliation correction
note. Minors' SPI is now framed as a conditional sub-case of kind=person, not the
table's purpose. Regenerated dossier + packet .docx.

Co-Authored-By: Claude Opus 4.8 <noreply@anthropic.com>
</commit_message>
<xml_diff>
--- a/Counsel_Review_Packet_NPC_Privacy_2026-07-13.docx
+++ b/Counsel_Review_Packet_NPC_Privacy_2026-07-13.docx
@@ -567,13 +567,60 @@
           <w:b/>
           <w:bCs/>
         </w:rPr>
-        <w:t xml:space="preserve">Dependents (may be minors):</w:t>
-      </w:r>
-      <w:r>
-        <w:t xml:space="preserve"> </w:t>
-      </w:r>
-      <w:r>
-        <w:t xml:space="preserve">a child’s</w:t>
+        <w:t xml:space="preserve">Dependents (a generic list — person, pet, or anything):</w:t>
+      </w:r>
+      <w:r>
+        <w:t xml:space="preserve"> </w:t>
+      </w:r>
+      <w:r>
+        <w:t xml:space="preserve">the feature is</w:t>
+      </w:r>
+      <w:r>
+        <w:t xml:space="preserve"> </w:t>
+      </w:r>
+      <w:r>
+        <w:rPr>
+          <w:i/>
+          <w:iCs/>
+        </w:rPr>
+        <w:t xml:space="preserve">not</w:t>
+      </w:r>
+      <w:r>
+        <w:t xml:space="preserve"> </w:t>
+      </w:r>
+      <w:r>
+        <w:t xml:space="preserve">a minors registry; a</w:t>
+      </w:r>
+      <w:r>
+        <w:t xml:space="preserve"> </w:t>
+      </w:r>
+      <w:r>
+        <w:rPr>
+          <w:rStyle w:val="VerbatimChar"/>
+        </w:rPr>
+        <w:t xml:space="preserve">dependent_kind</w:t>
+      </w:r>
+      <w:r>
+        <w:t xml:space="preserve"> </w:t>
+      </w:r>
+      <w:r>
+        <w:t xml:space="preserve">(person / pet / other) discriminates it. Only a</w:t>
+      </w:r>
+      <w:r>
+        <w:t xml:space="preserve"> </w:t>
+      </w:r>
+      <w:r>
+        <w:rPr>
+          <w:b/>
+          <w:bCs/>
+        </w:rPr>
+        <w:t xml:space="preserve">person</w:t>
+      </w:r>
+      <w:r>
+        <w:t xml:space="preserve"> </w:t>
+      </w:r>
+      <w:r>
+        <w:t xml:space="preserve">dependent may carry</w:t>
       </w:r>
       <w:r>
         <w:t xml:space="preserve"> </w:t>
@@ -586,7 +633,23 @@
         <w:t xml:space="preserve">name, birth date, sex, religion</w:t>
       </w:r>
       <w:r>
-        <w:t xml:space="preserve">, with guardian-consent timestamps. A household model lets a</w:t>
+        <w:t xml:space="preserve"> </w:t>
+      </w:r>
+      <w:r>
+        <w:t xml:space="preserve">(guardian-consent timestamps); pets/other carry no sensitive data. When a person-dependent is a</w:t>
+      </w:r>
+      <w:r>
+        <w:t xml:space="preserve"> </w:t>
+      </w:r>
+      <w:r>
+        <w:rPr>
+          <w:b/>
+          <w:bCs/>
+        </w:rPr>
+        <w:t xml:space="preserve">child</w:t>
+      </w:r>
+      <w:r>
+        <w:t xml:space="preserve">, a household model lets a</w:t>
       </w:r>
       <w:r>
         <w:t xml:space="preserve"> </w:t>
@@ -599,23 +662,20 @@
         <w:t xml:space="preserve">spouse account read a shared child’s record</w:t>
       </w:r>
       <w:r>
-        <w:t xml:space="preserve">, and that access is</w:t>
-      </w:r>
-      <w:r>
-        <w:t xml:space="preserve"> </w:t>
-      </w:r>
-      <w:r>
-        <w:rPr>
-          <w:b/>
-          <w:bCs/>
-        </w:rPr>
-        <w:t xml:space="preserve">retained after separation/annulment</w:t>
-      </w:r>
-      <w:r>
-        <w:t xml:space="preserve"> </w:t>
-      </w:r>
-      <w:r>
-        <w:t xml:space="preserve">for continued co-parenting.</w:t>
+        <w:t xml:space="preserve">, retained after separation/annulment for co-parenting. So minors’ SPI is a</w:t>
+      </w:r>
+      <w:r>
+        <w:t xml:space="preserve"> </w:t>
+      </w:r>
+      <w:r>
+        <w:rPr>
+          <w:b/>
+          <w:bCs/>
+        </w:rPr>
+        <w:t xml:space="preserve">conditional sub-case of the person kind</w:t>
+      </w:r>
+      <w:r>
+        <w:t xml:space="preserve">, not the table’s purpose — but it can occur.</w:t>
       </w:r>
       <w:r>
         <w:t xml:space="preserve"> </w:t>

</xml_diff>